<commit_message>
docs(core-agent): reconcile concurrently synced UI baseline
</commit_message>
<xml_diff>
--- a/chenchen/docs/core-agent-daily-update-2026-10-20.docx
+++ b/chenchen/docs/core-agent-daily-update-2026-10-20.docx
@@ -20,12 +20,12 @@
     </w:p>
     <w:p>
       <w:r>
-        <w:t>已实现：今天报告改为先结论、再依据，新增 TXT 下载；空方案触发补资料，不编造比较结论。团队 main 另有投资总览 UI 恢复提交 6ead62e，个人 main 尚无该提交，本轮不搬运业务代码。两条主链路仍停在正式 Risk 交接及 PAPER 边界，正式 Risk 审核闭环待 Owner 确认。</w:t>
+        <w:t>已实现：今天报告改为先结论、再依据，新增 TXT 下载；空方案触发补资料，不编造比较结论。团队 main 投资总览 UI 提交为 6ead62e；个人 main 在本轮期间同步同项提交 3a611dd，两仓库现均包含该 UI，本轮未搬运业务代码。两条主链路仍停在正式 Risk 交接及 PAPER 边界，正式 Risk 审核闭环待 Owner 确认。</w:t>
       </w:r>
     </w:p>
     <w:p>
       <w:r>
-        <w:t>今日已有业务代码变更；本次日报自动化未修改业务代码、Quant、Memory、Risk、UI 实现或运行时 Schema。保留当天早先日报；其中 UI 描述只能证明团队基线，不能推广为两个 main 完全一致。</w:t>
+        <w:t>今日已有业务代码变更；本次日报自动化未修改业务代码、Quant、Memory、Risk、UI 实现或运行时 Schema。保留当天早先日报；最终核对确认两个 main 均已包含投资总览 UI。</w:t>
       </w:r>
     </w:p>
     <w:p>
@@ -155,7 +155,7 @@
     </w:p>
     <w:p>
       <w:r>
-        <w:t>UI：两 main 的投资总览基线不同；需确认正式交付版本，并给出同任务等待/拒绝/缺资料/过期/409/503 的恢复与手机真机验收回执。本地页面及报告测试不等于正式部署。</w:t>
+        <w:t>UI：两个 main 已含投资总览，本地展示通过仍不代表正式部署；需确认正式交付版本，并给出同任务等待/拒绝/缺资料/过期/409/503 的恢复与手机真机验收回执。本地页面及报告测试不等于正式部署。</w:t>
       </w:r>
     </w:p>
     <w:p>
@@ -178,7 +178,7 @@
     </w:p>
     <w:p>
       <w:r>
-        <w:t>先由 Risk 确认可信接收/回写与回执缺失协议，Backend 冻结两链路字段映射；UI 明确采用哪个 main 基线并联验恢复状态。Memory、Quant/Data 提供可信引用与版本时效样例。继续保持交接停止点与真实执行阻断。</w:t>
+        <w:t>先由 Risk 确认可信接收/回写与回执缺失协议，Backend 冻结两链路字段映射；UI 确认正式交付提交并联验恢复状态。Memory、Quant/Data 提供可信引用与版本时效样例。继续保持交接停止点与真实执行阻断。</w:t>
       </w:r>
     </w:p>
     <w:p>

</xml_diff>